<commit_message>
added lab documentation 2
</commit_message>
<xml_diff>
--- a/lab4.docx
+++ b/lab4.docx
@@ -158,6 +158,9 @@
     </w:p>
     <w:p>
       <w:r>
+        <w:rPr>
+          <w:noProof/>
+        </w:rPr>
         <w:drawing>
           <wp:inline distT="0" distB="0" distL="0" distR="0" wp14:anchorId="3232C411" wp14:editId="7B5E2D58">
             <wp:extent cx="4895268" cy="3929380"/>
@@ -210,6 +213,9 @@
     </w:p>
     <w:p>
       <w:r>
+        <w:rPr>
+          <w:noProof/>
+        </w:rPr>
         <w:drawing>
           <wp:inline distT="0" distB="0" distL="0" distR="0" wp14:anchorId="2501E9DA" wp14:editId="42660DA7">
             <wp:extent cx="4766984" cy="3691890"/>
@@ -250,15 +256,7 @@
     <w:p>
       <w:r>
         <w:lastRenderedPageBreak/>
-        <w:t xml:space="preserve">Sikertelen eredménye lett a </w:t>
-      </w:r>
-      <w:proofErr w:type="spellStart"/>
-      <w:r>
-        <w:t>coverage</w:t>
-      </w:r>
-      <w:proofErr w:type="spellEnd"/>
-      <w:r>
-        <w:t xml:space="preserve"> a fájlban megadott 80% helyett csak </w:t>
+        <w:t xml:space="preserve">Sikertelen eredménye lett a coverage a fájlban megadott 80% helyett csak </w:t>
       </w:r>
       <w:r>
         <w:rPr>
@@ -285,6 +283,9 @@
     </w:p>
     <w:p>
       <w:r>
+        <w:rPr>
+          <w:noProof/>
+        </w:rPr>
         <w:drawing>
           <wp:inline distT="0" distB="0" distL="0" distR="0" wp14:anchorId="4B353A56" wp14:editId="38665474">
             <wp:extent cx="5760720" cy="1693545"/>
@@ -334,6 +335,12 @@
       <w:r>
         <w:t>Feladat</w:t>
       </w:r>
+      <w:r>
+        <w:t xml:space="preserve">: </w:t>
+      </w:r>
+      <w:r>
+        <w:t>A parancssori interfész kipróbálása</w:t>
+      </w:r>
     </w:p>
     <w:p>
       <w:pPr>
@@ -629,15 +636,7 @@
         <w:pStyle w:val="Code"/>
       </w:pPr>
       <w:r>
-        <w:t xml:space="preserve">[INFO] Total </w:t>
-      </w:r>
-      <w:proofErr w:type="spellStart"/>
-      <w:r>
-        <w:t>time</w:t>
-      </w:r>
-      <w:proofErr w:type="spellEnd"/>
-      <w:r>
-        <w:t>:  01:04 min</w:t>
+        <w:t>[INFO] Total time:  01:04 min</w:t>
       </w:r>
     </w:p>
     <w:p>
@@ -645,84 +644,652 @@
         <w:pStyle w:val="Code"/>
       </w:pPr>
       <w:r>
-        <w:t xml:space="preserve">[INFO] </w:t>
-      </w:r>
-      <w:proofErr w:type="spellStart"/>
-      <w:r>
-        <w:t>Finished</w:t>
-      </w:r>
-      <w:proofErr w:type="spellEnd"/>
-      <w:r>
+        <w:t>[INFO] Finished at: 2026-10-23T16:15:11+02:00</w:t>
+      </w:r>
+    </w:p>
+    <w:p>
+      <w:pPr>
+        <w:pStyle w:val="Code"/>
+      </w:pPr>
+      <w:r>
+        <w:t>[INFO] ---------------------------------</w:t>
+      </w:r>
+    </w:p>
+    <w:p>
+      <w:pPr>
+        <w:pStyle w:val="Code"/>
+      </w:pPr>
+    </w:p>
+    <w:p>
+      <w:r>
+        <w:t>Létrehoztam egy gt4500at 5 lövéssel mind2 tárolóban, 0% fail rate-tel. 7-szer tüzelte. 5ször sikerrel, 2szer sikertelenül, mert kifogyott.</w:t>
+      </w:r>
+      <w:r>
+        <w:t xml:space="preserve"> meghívtam a help parancsot is ami kiírta a műveleteket.</w:t>
+      </w:r>
+    </w:p>
+    <w:p>
+      <w:pPr>
+        <w:pStyle w:val="Cmsor1"/>
+        <w:numPr>
+          <w:ilvl w:val="0"/>
+          <w:numId w:val="0"/>
+        </w:numPr>
+      </w:pPr>
+      <w:r>
+        <w:t>4.1 Feladat: Teszttervezés</w:t>
+      </w:r>
+    </w:p>
+    <w:tbl>
+      <w:tblPr>
+        <w:tblStyle w:val="Rcsostblzat"/>
+        <w:tblW w:w="0" w:type="auto"/>
+        <w:tblInd w:w="38" w:type="dxa"/>
+        <w:tblLook w:val="04A0" w:firstRow="1" w:lastRow="0" w:firstColumn="1" w:lastColumn="0" w:noHBand="0" w:noVBand="1"/>
+      </w:tblPr>
+      <w:tblGrid>
+        <w:gridCol w:w="3472"/>
+        <w:gridCol w:w="5740"/>
+      </w:tblGrid>
+      <w:tr>
+        <w:tc>
+          <w:tcPr>
+            <w:tcW w:w="3472" w:type="dxa"/>
+          </w:tcPr>
+          <w:p>
+            <w:pPr>
+              <w:jc w:val="left"/>
+            </w:pPr>
+            <w:r>
+              <w:t>Tesztelt követelmény</w:t>
+            </w:r>
+          </w:p>
+        </w:tc>
+        <w:tc>
+          <w:tcPr>
+            <w:tcW w:w="5740" w:type="dxa"/>
+          </w:tcPr>
+          <w:p>
+            <w:r>
+              <w:t xml:space="preserve">a GT4500 </w:t>
+            </w:r>
+            <w:r>
+              <w:t>ALL tüzelési módjával lehet tüzelni</w:t>
+            </w:r>
+          </w:p>
+        </w:tc>
+      </w:tr>
+      <w:tr>
+        <w:tc>
+          <w:tcPr>
+            <w:tcW w:w="3472" w:type="dxa"/>
+          </w:tcPr>
+          <w:p>
+            <w:pPr>
+              <w:jc w:val="left"/>
+            </w:pPr>
+            <w:r>
+              <w:t>Előfeltételek</w:t>
+            </w:r>
+            <w:r>
+              <w:t xml:space="preserve"> </w:t>
+            </w:r>
+            <w:r>
+              <w:t>(kiindulási állapot)</w:t>
+            </w:r>
+          </w:p>
+        </w:tc>
+        <w:tc>
+          <w:tcPr>
+            <w:tcW w:w="5740" w:type="dxa"/>
+          </w:tcPr>
+          <w:p>
+            <w:r>
+              <w:t>van legalább 1</w:t>
+            </w:r>
+            <w:r>
+              <w:t>-1</w:t>
+            </w:r>
+            <w:r>
+              <w:t xml:space="preserve"> torpedó</w:t>
+            </w:r>
+            <w:r>
+              <w:t xml:space="preserve"> mindkét torpedostoreban</w:t>
+            </w:r>
+          </w:p>
+        </w:tc>
+      </w:tr>
+      <w:tr>
+        <w:tc>
+          <w:tcPr>
+            <w:tcW w:w="3472" w:type="dxa"/>
+          </w:tcPr>
+          <w:p>
+            <w:pPr>
+              <w:jc w:val="left"/>
+            </w:pPr>
+            <w:r>
+              <w:t>A teszt lépései</w:t>
+            </w:r>
+          </w:p>
+        </w:tc>
+        <w:tc>
+          <w:tcPr>
+            <w:tcW w:w="5740" w:type="dxa"/>
+          </w:tcPr>
+          <w:p>
+            <w:r>
+              <w:t xml:space="preserve">tüzelünk mindkét torpedóval: </w:t>
+            </w:r>
+            <w:r>
+              <w:t>TORPEDO,</w:t>
+            </w:r>
+            <w:r>
+              <w:t>ALL parancs</w:t>
+            </w:r>
+          </w:p>
+        </w:tc>
+      </w:tr>
+      <w:tr>
+        <w:tc>
+          <w:tcPr>
+            <w:tcW w:w="3472" w:type="dxa"/>
+          </w:tcPr>
+          <w:p>
+            <w:pPr>
+              <w:jc w:val="left"/>
+            </w:pPr>
+            <w:r>
+              <w:t>Elvárt kimenet/eredmény</w:t>
+            </w:r>
+          </w:p>
+        </w:tc>
+        <w:tc>
+          <w:tcPr>
+            <w:tcW w:w="5740" w:type="dxa"/>
+          </w:tcPr>
+          <w:p>
+            <w:r>
+              <w:t>a TORPEDO parancs eredménye SUCCESS</w:t>
+            </w:r>
+          </w:p>
+        </w:tc>
+      </w:tr>
+    </w:tbl>
+    <w:p/>
+    <w:p/>
+    <w:tbl>
+      <w:tblPr>
+        <w:tblStyle w:val="Rcsostblzat"/>
+        <w:tblW w:w="0" w:type="auto"/>
+        <w:tblInd w:w="38" w:type="dxa"/>
+        <w:tblLook w:val="04A0" w:firstRow="1" w:lastRow="0" w:firstColumn="1" w:lastColumn="0" w:noHBand="0" w:noVBand="1"/>
+      </w:tblPr>
+      <w:tblGrid>
+        <w:gridCol w:w="3472"/>
+        <w:gridCol w:w="5740"/>
+      </w:tblGrid>
+      <w:tr>
+        <w:tc>
+          <w:tcPr>
+            <w:tcW w:w="3472" w:type="dxa"/>
+          </w:tcPr>
+          <w:p>
+            <w:pPr>
+              <w:jc w:val="left"/>
+            </w:pPr>
+            <w:r>
+              <w:t>Tesztelt követelmény</w:t>
+            </w:r>
+          </w:p>
+        </w:tc>
+        <w:tc>
+          <w:tcPr>
+            <w:tcW w:w="5740" w:type="dxa"/>
+          </w:tcPr>
+          <w:p>
+            <w:r>
+              <w:t xml:space="preserve">a GT4500 </w:t>
+            </w:r>
+            <w:r>
+              <w:t>SINGLE módjával lehet úgy, tüzelni, hogy az első ágyú öres, és a második tüzel</w:t>
+            </w:r>
+          </w:p>
+        </w:tc>
+      </w:tr>
+      <w:tr>
+        <w:tc>
+          <w:tcPr>
+            <w:tcW w:w="3472" w:type="dxa"/>
+          </w:tcPr>
+          <w:p>
+            <w:pPr>
+              <w:jc w:val="left"/>
+            </w:pPr>
+            <w:r>
+              <w:t>Előfeltételek</w:t>
+            </w:r>
+            <w:r>
+              <w:t xml:space="preserve"> </w:t>
+            </w:r>
+            <w:r>
+              <w:t>(kiindulási állapot)</w:t>
+            </w:r>
+          </w:p>
+        </w:tc>
+        <w:tc>
+          <w:tcPr>
+            <w:tcW w:w="5740" w:type="dxa"/>
+          </w:tcPr>
+          <w:p>
+            <w:r>
+              <w:t>A soron következő ágyú legyen üres, a nem következőben legyen legalább egy lövedék</w:t>
+            </w:r>
+          </w:p>
+        </w:tc>
+      </w:tr>
+      <w:tr>
+        <w:tc>
+          <w:tcPr>
+            <w:tcW w:w="3472" w:type="dxa"/>
+          </w:tcPr>
+          <w:p>
+            <w:pPr>
+              <w:jc w:val="left"/>
+            </w:pPr>
+            <w:r>
+              <w:t>A teszt lépései</w:t>
+            </w:r>
+          </w:p>
+        </w:tc>
+        <w:tc>
+          <w:tcPr>
+            <w:tcW w:w="5740" w:type="dxa"/>
+          </w:tcPr>
+          <w:p>
+            <w:r>
+              <w:t xml:space="preserve">tüzelünk mindkét torpedóval: </w:t>
+            </w:r>
+            <w:r>
+              <w:t>TORPEDO,</w:t>
+            </w:r>
+            <w:r>
+              <w:t>SINGLE</w:t>
+            </w:r>
+            <w:r>
+              <w:t xml:space="preserve"> parancs</w:t>
+            </w:r>
+          </w:p>
+        </w:tc>
+      </w:tr>
+      <w:tr>
+        <w:tc>
+          <w:tcPr>
+            <w:tcW w:w="3472" w:type="dxa"/>
+          </w:tcPr>
+          <w:p>
+            <w:pPr>
+              <w:jc w:val="left"/>
+            </w:pPr>
+            <w:r>
+              <w:t>Elvárt kimenet/eredmény</w:t>
+            </w:r>
+          </w:p>
+        </w:tc>
+        <w:tc>
+          <w:tcPr>
+            <w:tcW w:w="5740" w:type="dxa"/>
+          </w:tcPr>
+          <w:p>
+            <w:r>
+              <w:t>a TORPEDO parancs eredménye SUCCESS</w:t>
+            </w:r>
+          </w:p>
+        </w:tc>
+      </w:tr>
+    </w:tbl>
+    <w:p/>
+    <w:p>
+      <w:r>
+        <w:t>Az első tesztet azért választottam mert az ALL mode egy fontos mode ami kritikus a hajó védelme szempontjából.</w:t>
+      </w:r>
+    </w:p>
+    <w:p>
+      <w:r>
+        <w:t>A második teszt egy bonyolultabb mechanika működését teszteli, ami szintén fontos lehet.</w:t>
+      </w:r>
+    </w:p>
+    <w:p>
+      <w:r>
+        <w:drawing>
+          <wp:anchor distT="0" distB="0" distL="114300" distR="114300" simplePos="0" relativeHeight="251658752" behindDoc="0" locked="0" layoutInCell="1" allowOverlap="1" wp14:anchorId="0C53BB18" wp14:editId="14DD070C">
+            <wp:simplePos x="0" y="0"/>
+            <wp:positionH relativeFrom="column">
+              <wp:posOffset>205105</wp:posOffset>
+            </wp:positionH>
+            <wp:positionV relativeFrom="paragraph">
+              <wp:posOffset>6461125</wp:posOffset>
+            </wp:positionV>
+            <wp:extent cx="5760720" cy="2573020"/>
+            <wp:effectExtent l="0" t="0" r="0" b="0"/>
+            <wp:wrapSquare wrapText="bothSides"/>
+            <wp:docPr id="1677327977" name="Kép 1"/>
+            <wp:cNvGraphicFramePr>
+              <a:graphicFrameLocks xmlns:a="http://schemas.openxmlformats.org/drawingml/2006/main" noChangeAspect="1"/>
+            </wp:cNvGraphicFramePr>
+            <a:graphic xmlns:a="http://schemas.openxmlformats.org/drawingml/2006/main">
+              <a:graphicData uri="http://schemas.openxmlformats.org/drawingml/2006/picture">
+                <pic:pic xmlns:pic="http://schemas.openxmlformats.org/drawingml/2006/picture">
+                  <pic:nvPicPr>
+                    <pic:cNvPr id="1677327977" name=""/>
+                    <pic:cNvPicPr/>
+                  </pic:nvPicPr>
+                  <pic:blipFill>
+                    <a:blip r:embed="rId15">
+                      <a:extLst>
+                        <a:ext uri="{28A0092B-C50C-407E-A947-70E740481C1C}">
+                          <a14:useLocalDpi xmlns:a14="http://schemas.microsoft.com/office/drawing/2010/main" val="0"/>
+                        </a:ext>
+                      </a:extLst>
+                    </a:blip>
+                    <a:stretch>
+                      <a:fillRect/>
+                    </a:stretch>
+                  </pic:blipFill>
+                  <pic:spPr>
+                    <a:xfrm>
+                      <a:off x="0" y="0"/>
+                      <a:ext cx="5760720" cy="2573020"/>
+                    </a:xfrm>
+                    <a:prstGeom prst="rect">
+                      <a:avLst/>
+                    </a:prstGeom>
+                  </pic:spPr>
+                </pic:pic>
+              </a:graphicData>
+            </a:graphic>
+          </wp:anchor>
+        </w:drawing>
+      </w:r>
+    </w:p>
+    <w:p>
+      <w:pPr>
+        <w:pStyle w:val="Cmsor2"/>
+        <w:numPr>
+          <w:ilvl w:val="0"/>
+          <w:numId w:val="0"/>
+        </w:numPr>
+      </w:pPr>
+      <w:r>
+        <w:t>4.2 Feladat: tesztelés</w:t>
+      </w:r>
+    </w:p>
+    <w:p/>
+    <w:p>
+      <w:pPr>
+        <w:rPr>
+          <w:b/>
+          <w:bCs/>
+          <w:sz w:val="28"/>
+          <w:szCs w:val="32"/>
+        </w:rPr>
+      </w:pPr>
+      <w:r>
+        <w:rPr>
+          <w:b/>
+          <w:bCs/>
+          <w:sz w:val="28"/>
+          <w:szCs w:val="32"/>
+        </w:rPr>
+        <w:lastRenderedPageBreak/>
+        <w:t xml:space="preserve">4.3 Feladat: </w:t>
+      </w:r>
+      <w:r>
+        <w:rPr>
+          <w:b/>
+          <w:bCs/>
+          <w:sz w:val="28"/>
+          <w:szCs w:val="32"/>
+        </w:rPr>
+        <w:t>A tesztkészlet feltöltése a GitHub-ra</w:t>
+      </w:r>
+    </w:p>
+    <w:p/>
+    <w:p>
+      <w:pPr>
+        <w:rPr>
+          <w:b/>
+          <w:bCs/>
+          <w:sz w:val="28"/>
+          <w:szCs w:val="32"/>
+        </w:rPr>
+      </w:pPr>
+      <w:r>
+        <w:rPr>
+          <w:b/>
+          <w:bCs/>
+          <w:sz w:val="28"/>
+          <w:szCs w:val="32"/>
+        </w:rPr>
+        <w:drawing>
+          <wp:inline distT="0" distB="0" distL="0" distR="0" wp14:anchorId="0C38CFC8" wp14:editId="18E54DF7">
+            <wp:extent cx="4716780" cy="3620254"/>
+            <wp:effectExtent l="0" t="0" r="0" b="0"/>
+            <wp:docPr id="315710633" name="Kép 1"/>
+            <wp:cNvGraphicFramePr>
+              <a:graphicFrameLocks xmlns:a="http://schemas.openxmlformats.org/drawingml/2006/main" noChangeAspect="1"/>
+            </wp:cNvGraphicFramePr>
+            <a:graphic xmlns:a="http://schemas.openxmlformats.org/drawingml/2006/main">
+              <a:graphicData uri="http://schemas.openxmlformats.org/drawingml/2006/picture">
+                <pic:pic xmlns:pic="http://schemas.openxmlformats.org/drawingml/2006/picture">
+                  <pic:nvPicPr>
+                    <pic:cNvPr id="315710633" name=""/>
+                    <pic:cNvPicPr/>
+                  </pic:nvPicPr>
+                  <pic:blipFill>
+                    <a:blip r:embed="rId16"/>
+                    <a:stretch>
+                      <a:fillRect/>
+                    </a:stretch>
+                  </pic:blipFill>
+                  <pic:spPr>
+                    <a:xfrm>
+                      <a:off x="0" y="0"/>
+                      <a:ext cx="4719887" cy="3622639"/>
+                    </a:xfrm>
+                    <a:prstGeom prst="rect">
+                      <a:avLst/>
+                    </a:prstGeom>
+                  </pic:spPr>
+                </pic:pic>
+              </a:graphicData>
+            </a:graphic>
+          </wp:inline>
+        </w:drawing>
+      </w:r>
+    </w:p>
+    <w:p>
+      <w:r>
+        <w:t>nem elég jó a lefedettség</w:t>
+      </w:r>
+      <w:r>
+        <w:t>, ezért nem lehet mergelni.</w:t>
+      </w:r>
+    </w:p>
+    <w:p>
+      <w:pPr>
+        <w:pStyle w:val="Cmsor1"/>
+        <w:numPr>
+          <w:ilvl w:val="0"/>
+          <w:numId w:val="8"/>
+        </w:numPr>
+      </w:pPr>
+      <w:r>
+        <w:t>Feladat: Kódlefedettség mérése</w:t>
+      </w:r>
+    </w:p>
+    <w:p>
+      <w:r>
+        <w:drawing>
+          <wp:inline distT="0" distB="0" distL="0" distR="0" wp14:anchorId="66969ABD" wp14:editId="65E0D2D9">
+            <wp:extent cx="5760720" cy="1181735"/>
+            <wp:effectExtent l="0" t="0" r="0" b="0"/>
+            <wp:docPr id="1198195377" name="Kép 1"/>
+            <wp:cNvGraphicFramePr>
+              <a:graphicFrameLocks xmlns:a="http://schemas.openxmlformats.org/drawingml/2006/main" noChangeAspect="1"/>
+            </wp:cNvGraphicFramePr>
+            <a:graphic xmlns:a="http://schemas.openxmlformats.org/drawingml/2006/main">
+              <a:graphicData uri="http://schemas.openxmlformats.org/drawingml/2006/picture">
+                <pic:pic xmlns:pic="http://schemas.openxmlformats.org/drawingml/2006/picture">
+                  <pic:nvPicPr>
+                    <pic:cNvPr id="1198195377" name=""/>
+                    <pic:cNvPicPr/>
+                  </pic:nvPicPr>
+                  <pic:blipFill>
+                    <a:blip r:embed="rId17"/>
+                    <a:stretch>
+                      <a:fillRect/>
+                    </a:stretch>
+                  </pic:blipFill>
+                  <pic:spPr>
+                    <a:xfrm>
+                      <a:off x="0" y="0"/>
+                      <a:ext cx="5760720" cy="1181735"/>
+                    </a:xfrm>
+                    <a:prstGeom prst="rect">
+                      <a:avLst/>
+                    </a:prstGeom>
+                  </pic:spPr>
+                </pic:pic>
+              </a:graphicData>
+            </a:graphic>
+          </wp:inline>
+        </w:drawing>
+      </w:r>
+    </w:p>
+    <w:p>
+      <w:pPr>
+        <w:pStyle w:val="Cmsor1"/>
+        <w:shd w:val="clear" w:color="auto" w:fill="FFFFFF"/>
+        <w:spacing w:before="360"/>
+        <w:rPr>
+          <w:rFonts w:ascii="Segoe UI" w:hAnsi="Segoe UI" w:cs="Segoe UI"/>
+          <w:color w:val="1F2328"/>
+        </w:rPr>
+      </w:pPr>
+      <w:r>
+        <w:t>feladat:</w:t>
+      </w:r>
+      <w:r>
+        <w:rPr>
+          <w:rFonts w:ascii="Segoe UI" w:hAnsi="Segoe UI" w:cs="Segoe UI"/>
+          <w:color w:val="1F2328"/>
+        </w:rPr>
         <w:t xml:space="preserve"> </w:t>
       </w:r>
-      <w:proofErr w:type="spellStart"/>
-      <w:r>
-        <w:t>at</w:t>
-      </w:r>
-      <w:proofErr w:type="spellEnd"/>
-      <w:r>
-        <w:t>: 2026-10-23T16:15:11+02:00</w:t>
-      </w:r>
-    </w:p>
-    <w:p>
-      <w:pPr>
-        <w:pStyle w:val="Code"/>
-      </w:pPr>
-      <w:r>
-        <w:t>[INFO] ---------------------------------</w:t>
-      </w:r>
-    </w:p>
-    <w:p>
-      <w:pPr>
-        <w:pStyle w:val="Code"/>
-      </w:pPr>
-    </w:p>
-    <w:p>
-      <w:r>
-        <w:t xml:space="preserve">Létrehoztam egy gt4500at 5 lövéssel mind2 tárolóban, 0% </w:t>
-      </w:r>
-      <w:proofErr w:type="spellStart"/>
-      <w:r>
-        <w:t>fail</w:t>
-      </w:r>
-      <w:proofErr w:type="spellEnd"/>
-      <w:r>
-        <w:t xml:space="preserve"> </w:t>
-      </w:r>
-      <w:proofErr w:type="spellStart"/>
-      <w:r>
-        <w:t>rate</w:t>
-      </w:r>
-      <w:proofErr w:type="spellEnd"/>
-      <w:r>
-        <w:t>-tel. 7-szer tüzelte. 5ször sikerrel, 2szer sikertelenül, mert kifogyott.</w:t>
-      </w:r>
-      <w:r>
-        <w:t xml:space="preserve"> meghívtam a </w:t>
-      </w:r>
-      <w:proofErr w:type="spellStart"/>
-      <w:r>
-        <w:t>help</w:t>
-      </w:r>
-      <w:proofErr w:type="spellEnd"/>
-      <w:r>
-        <w:t xml:space="preserve"> parancsot </w:t>
-      </w:r>
-      <w:proofErr w:type="gramStart"/>
-      <w:r>
-        <w:t>is</w:t>
-      </w:r>
-      <w:proofErr w:type="gramEnd"/>
-      <w:r>
-        <w:t xml:space="preserve"> ami kiírta a műveleteket.</w:t>
-      </w:r>
-    </w:p>
-    <w:p/>
+      <w:r>
+        <w:rPr>
+          <w:rFonts w:ascii="Segoe UI" w:hAnsi="Segoe UI" w:cs="Segoe UI"/>
+          <w:color w:val="1F2328"/>
+        </w:rPr>
+        <w:t>Teljes lefedettség elérése</w:t>
+      </w:r>
+    </w:p>
+    <w:p>
+      <w:r>
+        <w:drawing>
+          <wp:inline distT="0" distB="0" distL="0" distR="0" wp14:anchorId="495484D8" wp14:editId="7CCFE6B0">
+            <wp:extent cx="5760720" cy="1480185"/>
+            <wp:effectExtent l="0" t="0" r="0" b="0"/>
+            <wp:docPr id="2045264480" name="Kép 1"/>
+            <wp:cNvGraphicFramePr>
+              <a:graphicFrameLocks xmlns:a="http://schemas.openxmlformats.org/drawingml/2006/main" noChangeAspect="1"/>
+            </wp:cNvGraphicFramePr>
+            <a:graphic xmlns:a="http://schemas.openxmlformats.org/drawingml/2006/main">
+              <a:graphicData uri="http://schemas.openxmlformats.org/drawingml/2006/picture">
+                <pic:pic xmlns:pic="http://schemas.openxmlformats.org/drawingml/2006/picture">
+                  <pic:nvPicPr>
+                    <pic:cNvPr id="2045264480" name=""/>
+                    <pic:cNvPicPr/>
+                  </pic:nvPicPr>
+                  <pic:blipFill>
+                    <a:blip r:embed="rId18"/>
+                    <a:stretch>
+                      <a:fillRect/>
+                    </a:stretch>
+                  </pic:blipFill>
+                  <pic:spPr>
+                    <a:xfrm>
+                      <a:off x="0" y="0"/>
+                      <a:ext cx="5760720" cy="1480185"/>
+                    </a:xfrm>
+                    <a:prstGeom prst="rect">
+                      <a:avLst/>
+                    </a:prstGeom>
+                  </pic:spPr>
+                </pic:pic>
+              </a:graphicData>
+            </a:graphic>
+          </wp:inline>
+        </w:drawing>
+      </w:r>
+    </w:p>
+    <w:p>
+      <w:r>
+        <w:t xml:space="preserve">Nem lehet elérni a 100%ot. mert a </w:t>
+      </w:r>
+      <w:r>
+        <w:t>fireLaser</w:t>
+      </w:r>
+      <w:r>
+        <w:t xml:space="preserve"> fv-t nem hívja meg semmi sem mert a fv nincs implementálva így nem lehet tesztelni sem</w:t>
+      </w:r>
+    </w:p>
+    <w:p>
+      <w:r>
+        <w:lastRenderedPageBreak/>
+        <w:drawing>
+          <wp:inline distT="0" distB="0" distL="0" distR="0" wp14:anchorId="193CF13E" wp14:editId="183509CB">
+            <wp:extent cx="5760720" cy="3098165"/>
+            <wp:effectExtent l="0" t="0" r="0" b="0"/>
+            <wp:docPr id="1748349168" name="Kép 1"/>
+            <wp:cNvGraphicFramePr>
+              <a:graphicFrameLocks xmlns:a="http://schemas.openxmlformats.org/drawingml/2006/main" noChangeAspect="1"/>
+            </wp:cNvGraphicFramePr>
+            <a:graphic xmlns:a="http://schemas.openxmlformats.org/drawingml/2006/main">
+              <a:graphicData uri="http://schemas.openxmlformats.org/drawingml/2006/picture">
+                <pic:pic xmlns:pic="http://schemas.openxmlformats.org/drawingml/2006/picture">
+                  <pic:nvPicPr>
+                    <pic:cNvPr id="1748349168" name=""/>
+                    <pic:cNvPicPr/>
+                  </pic:nvPicPr>
+                  <pic:blipFill>
+                    <a:blip r:embed="rId19"/>
+                    <a:stretch>
+                      <a:fillRect/>
+                    </a:stretch>
+                  </pic:blipFill>
+                  <pic:spPr>
+                    <a:xfrm>
+                      <a:off x="0" y="0"/>
+                      <a:ext cx="5760720" cy="3098165"/>
+                    </a:xfrm>
+                    <a:prstGeom prst="rect">
+                      <a:avLst/>
+                    </a:prstGeom>
+                  </pic:spPr>
+                </pic:pic>
+              </a:graphicData>
+            </a:graphic>
+          </wp:inline>
+        </w:drawing>
+      </w:r>
+    </w:p>
     <w:sectPr>
-      <w:headerReference w:type="default" r:id="rId15"/>
-      <w:footerReference w:type="default" r:id="rId16"/>
-      <w:headerReference w:type="first" r:id="rId17"/>
-      <w:footerReference w:type="first" r:id="rId18"/>
+      <w:headerReference w:type="default" r:id="rId20"/>
+      <w:footerReference w:type="default" r:id="rId21"/>
+      <w:headerReference w:type="first" r:id="rId22"/>
+      <w:footerReference w:type="first" r:id="rId23"/>
       <w:pgSz w:w="11906" w:h="16838"/>
       <w:pgMar w:top="1417" w:right="1417" w:bottom="1417" w:left="1417" w:header="708" w:footer="708" w:gutter="0"/>
       <w:cols w:space="720"/>
@@ -1936,6 +2503,12 @@
     <w:abstractNumId w:val="1"/>
     <w:lvlOverride w:ilvl="0">
       <w:startOverride w:val="3"/>
+    </w:lvlOverride>
+  </w:num>
+  <w:num w:numId="8" w16cid:durableId="2002736925">
+    <w:abstractNumId w:val="1"/>
+    <w:lvlOverride w:ilvl="0">
+      <w:startOverride w:val="5"/>
     </w:lvlOverride>
   </w:num>
 </w:numbering>
@@ -2579,7 +3152,6 @@
   <w:style w:type="character" w:default="1" w:styleId="Bekezdsalapbettpusa">
     <w:name w:val="Default Paragraph Font"/>
     <w:uiPriority w:val="1"/>
-    <w:semiHidden/>
     <w:unhideWhenUsed/>
   </w:style>
   <w:style w:type="table" w:default="1" w:styleId="Normltblzat">
@@ -2783,7 +3355,6 @@
     <w:name w:val="Strong"/>
     <w:basedOn w:val="Bekezdsalapbettpusa"/>
     <w:uiPriority w:val="22"/>
-    <w:semiHidden/>
     <w:unhideWhenUsed/>
     <w:qFormat/>
     <w:rsid w:val="00051A69"/>
@@ -3721,21 +4292,10 @@
 </file>
 
 <file path=customXml/item1.xml><?xml version="1.0" encoding="utf-8"?>
-<p:properties xmlns:p="http://schemas.microsoft.com/office/2006/metadata/properties" xmlns:xsi="http://www.w3.org/2001/XMLSchema-instance" xmlns:pc="http://schemas.microsoft.com/office/infopath/2007/PartnerControls">
-  <documentManagement/>
-</p:properties>
+<b:Sources xmlns:b="http://schemas.openxmlformats.org/officeDocument/2006/bibliography" xmlns="http://schemas.openxmlformats.org/officeDocument/2006/bibliography" SelectedStyle="\APA.XSL" StyleName="APA"/>
 </file>
 
 <file path=customXml/item2.xml><?xml version="1.0" encoding="utf-8"?>
-<?mso-contentType ?>
-<FormTemplates xmlns="http://schemas.microsoft.com/sharepoint/v3/contenttype/forms">
-  <Display>DocumentLibraryForm</Display>
-  <Edit>DocumentLibraryForm</Edit>
-  <New>DocumentLibraryForm</New>
-</FormTemplates>
-</file>
-
-<file path=customXml/item3.xml><?xml version="1.0" encoding="utf-8"?>
 <ct:contentTypeSchema xmlns:ct="http://schemas.microsoft.com/office/2006/metadata/contentType" xmlns:ma="http://schemas.microsoft.com/office/2006/metadata/properties/metaAttributes" ct:_="" ma:_="" ma:contentTypeName="Document" ma:contentTypeID="0x01010013532243B581414188EF3F59D33FEB25" ma:contentTypeVersion="6" ma:contentTypeDescription="Create a new document." ma:contentTypeScope="" ma:versionID="3c8ff5c8fdb75f7e7c005cd9498d9aad">
   <xsd:schema xmlns:xsd="http://www.w3.org/2001/XMLSchema" xmlns:xs="http://www.w3.org/2001/XMLSchema" xmlns:p="http://schemas.microsoft.com/office/2006/metadata/properties" xmlns:ns2="ed64fe2c-2946-441a-bdf3-2120a1702011" xmlns:ns3="133b811b-0bc4-4944-9685-9128c8db5870" targetNamespace="http://schemas.microsoft.com/office/2006/metadata/properties" ma:root="true" ma:fieldsID="662e73e34ba43cc7db50fd596a5f3802" ns2:_="" ns3:_="">
     <xsd:import namespace="ed64fe2c-2946-441a-bdf3-2120a1702011"/>
@@ -3914,28 +4474,30 @@
 </ct:contentTypeSchema>
 </file>
 
+<file path=customXml/item3.xml><?xml version="1.0" encoding="utf-8"?>
+<?mso-contentType ?>
+<FormTemplates xmlns="http://schemas.microsoft.com/sharepoint/v3/contenttype/forms">
+  <Display>DocumentLibraryForm</Display>
+  <Edit>DocumentLibraryForm</Edit>
+  <New>DocumentLibraryForm</New>
+</FormTemplates>
+</file>
+
 <file path=customXml/item4.xml><?xml version="1.0" encoding="utf-8"?>
-<b:Sources xmlns:b="http://schemas.openxmlformats.org/officeDocument/2006/bibliography" xmlns="http://schemas.openxmlformats.org/officeDocument/2006/bibliography" SelectedStyle="\APA.XSL" StyleName="APA"/>
+<p:properties xmlns:p="http://schemas.microsoft.com/office/2006/metadata/properties" xmlns:xsi="http://www.w3.org/2001/XMLSchema-instance" xmlns:pc="http://schemas.microsoft.com/office/infopath/2007/PartnerControls">
+  <documentManagement/>
+</p:properties>
 </file>
 
 <file path=customXml/itemProps1.xml><?xml version="1.0" encoding="utf-8"?>
-<ds:datastoreItem xmlns:ds="http://schemas.openxmlformats.org/officeDocument/2006/customXml" ds:itemID="{448DC41E-2BDB-46C2-9930-EE3043C4CEF4}">
+<ds:datastoreItem xmlns:ds="http://schemas.openxmlformats.org/officeDocument/2006/customXml" ds:itemID="{F2C35FEF-1B90-4171-BF31-30718714B00B}">
   <ds:schemaRefs>
-    <ds:schemaRef ds:uri="http://schemas.microsoft.com/office/2006/metadata/properties"/>
-    <ds:schemaRef ds:uri="http://schemas.microsoft.com/office/infopath/2007/PartnerControls"/>
+    <ds:schemaRef ds:uri="http://schemas.openxmlformats.org/officeDocument/2006/bibliography"/>
   </ds:schemaRefs>
 </ds:datastoreItem>
 </file>
 
 <file path=customXml/itemProps2.xml><?xml version="1.0" encoding="utf-8"?>
-<ds:datastoreItem xmlns:ds="http://schemas.openxmlformats.org/officeDocument/2006/customXml" ds:itemID="{BEAA3410-39A0-400F-954D-D477DC421977}">
-  <ds:schemaRefs>
-    <ds:schemaRef ds:uri="http://schemas.microsoft.com/sharepoint/v3/contenttype/forms"/>
-  </ds:schemaRefs>
-</ds:datastoreItem>
-</file>
-
-<file path=customXml/itemProps3.xml><?xml version="1.0" encoding="utf-8"?>
 <ds:datastoreItem xmlns:ds="http://schemas.openxmlformats.org/officeDocument/2006/customXml" ds:itemID="{0897306F-4ACF-44AC-A4F8-E0D3818859D0}">
   <ds:schemaRefs>
     <ds:schemaRef ds:uri="http://schemas.microsoft.com/office/2006/metadata/contentType"/>
@@ -3954,10 +4516,19 @@
 </ds:datastoreItem>
 </file>
 
+<file path=customXml/itemProps3.xml><?xml version="1.0" encoding="utf-8"?>
+<ds:datastoreItem xmlns:ds="http://schemas.openxmlformats.org/officeDocument/2006/customXml" ds:itemID="{BEAA3410-39A0-400F-954D-D477DC421977}">
+  <ds:schemaRefs>
+    <ds:schemaRef ds:uri="http://schemas.microsoft.com/sharepoint/v3/contenttype/forms"/>
+  </ds:schemaRefs>
+</ds:datastoreItem>
+</file>
+
 <file path=customXml/itemProps4.xml><?xml version="1.0" encoding="utf-8"?>
-<ds:datastoreItem xmlns:ds="http://schemas.openxmlformats.org/officeDocument/2006/customXml" ds:itemID="{F2C35FEF-1B90-4171-BF31-30718714B00B}">
+<ds:datastoreItem xmlns:ds="http://schemas.openxmlformats.org/officeDocument/2006/customXml" ds:itemID="{448DC41E-2BDB-46C2-9930-EE3043C4CEF4}">
   <ds:schemaRefs>
-    <ds:schemaRef ds:uri="http://schemas.openxmlformats.org/officeDocument/2006/bibliography"/>
+    <ds:schemaRef ds:uri="http://schemas.microsoft.com/office/2006/metadata/properties"/>
+    <ds:schemaRef ds:uri="http://schemas.microsoft.com/office/infopath/2007/PartnerControls"/>
   </ds:schemaRefs>
 </ds:datastoreItem>
 </file>
</xml_diff>